<commit_message>
refactor: replace allure with pytest html reports
Co-authored-by: NghiaHuynh <huynhtrongnghia1996@users.noreply.github.com>
</commit_message>
<xml_diff>
--- a/reports/automation-test-framework-design.docx
+++ b/reports/automation-test-framework-design.docx
@@ -27,7 +27,7 @@
         </w:numPr>
       </w:pPr>
       <w:r>
-        <w:t xml:space="preserve">Python 3.12, pytest, Playwright Python, httpx, psycopg, allure-pytest, pydantic-settings, loguru, ruff, pyright, Git, Jenkins.</w:t>
+        <w:t xml:space="preserve">Python 3.12, pytest, Playwright Python, pytest-html, httpx, psycopg, pydantic-settings, loguru, ruff, pyright, Git, Jenkins.</w:t>
       </w:r>
     </w:p>
     <w:p>
@@ -83,7 +83,19 @@
         </w:numPr>
       </w:pPr>
       <w:r>
-        <w:t xml:space="preserve">Allure report va Jenkins CI/CD.</w:t>
+        <w:t xml:space="preserve">pytest-html report mot file HTML de mo va share.</w:t>
+      </w:r>
+    </w:p>
+    <w:p>
+      <w:pPr>
+        <w:pStyle w:val="ListParagraph"/>
+        <w:numPr>
+          <w:ilvl w:val="0"/>
+          <w:numId w:val="1"/>
+        </w:numPr>
+      </w:pPr>
+      <w:r>
+        <w:t xml:space="preserve">Screenshot/log/artifact khi fail.</w:t>
       </w:r>
     </w:p>
     <w:p>
@@ -127,7 +139,19 @@
         </w:numPr>
       </w:pPr>
       <w:r>
-        <w:t xml:space="preserve">src/test/resources/report-html: html va images resources.</w:t>
+        <w:t xml:space="preserve">reports/report.html la HTML report runtime.</w:t>
+      </w:r>
+    </w:p>
+    <w:p>
+      <w:pPr>
+        <w:pStyle w:val="ListParagraph"/>
+        <w:numPr>
+          <w:ilvl w:val="0"/>
+          <w:numId w:val="1"/>
+        </w:numPr>
+      </w:pPr>
+      <w:r>
+        <w:t xml:space="preserve">test-results luu screenshots va attachments.</w:t>
       </w:r>
     </w:p>
     <w:p>
@@ -271,7 +295,7 @@
         </w:numPr>
       </w:pPr>
       <w:r>
-        <w:t xml:space="preserve">Request/response co the attach vao Allure.</w:t>
+        <w:t xml:space="preserve">Response/debug artifact ghi vao test-results/attachments.</w:t>
       </w:r>
     </w:p>
     <w:p>
@@ -291,31 +315,19 @@
         </w:numPr>
       </w:pPr>
       <w:r>
-        <w:t xml:space="preserve">allure-pytest sinh allure-results.</w:t>
-      </w:r>
-    </w:p>
-    <w:p>
-      <w:pPr>
-        <w:pStyle w:val="ListParagraph"/>
-        <w:numPr>
-          <w:ilvl w:val="0"/>
-          <w:numId w:val="1"/>
-        </w:numPr>
-      </w:pPr>
-      <w:r>
-        <w:t xml:space="preserve">Allure HTML report o allure-report/index.html.</w:t>
-      </w:r>
-    </w:p>
-    <w:p>
-      <w:pPr>
-        <w:pStyle w:val="ListParagraph"/>
-        <w:numPr>
-          <w:ilvl w:val="0"/>
-          <w:numId w:val="1"/>
-        </w:numPr>
-      </w:pPr>
-      <w:r>
-        <w:t xml:space="preserve">Screenshot attach khi fail.</w:t>
+        <w:t xml:space="preserve">pytest-html sinh reports/report.html.</w:t>
+      </w:r>
+    </w:p>
+    <w:p>
+      <w:pPr>
+        <w:pStyle w:val="ListParagraph"/>
+        <w:numPr>
+          <w:ilvl w:val="0"/>
+          <w:numId w:val="1"/>
+        </w:numPr>
+      </w:pPr>
+      <w:r>
+        <w:t xml:space="preserve">Screenshot fail luu o test-results/screenshots va hien link trong report.</w:t>
       </w:r>
     </w:p>
     <w:p>
@@ -328,6 +340,18 @@
       </w:pPr>
       <w:r>
         <w:t xml:space="preserve">loguru ghi logs/automation.log.</w:t>
+      </w:r>
+    </w:p>
+    <w:p>
+      <w:pPr>
+        <w:pStyle w:val="ListParagraph"/>
+        <w:numPr>
+          <w:ilvl w:val="0"/>
+          <w:numId w:val="1"/>
+        </w:numPr>
+      </w:pPr>
+      <w:r>
+        <w:t xml:space="preserve">Khong can Java hoac report CLI rieng.</w:t>
       </w:r>
     </w:p>
     <w:p>

</xml_diff>